<commit_message>
Dokumente korrigiert und vervollstaendigt: Lessons Learned (Auftraggeber fix, Zahlen konsistent, vollstaendiges Teamfeedback), Maengelruege (richtige Adresse Koeln), Angebot (Summen auf 67.179,32 EUR korrigiert), Abnahmeprotokoll (komplett neu mit allen Positionen ausgefuellt)
</commit_message>
<xml_diff>
--- a/docs/04_Angebot/Angebot_VektorPlan.docx
+++ b/docs/04_Angebot/Angebot_VektorPlan.docx
@@ -964,11 +964,11 @@
     </w:p>
     <w:p>
       <w:r>
-        <w:t>Zwischensumme Hardware: 54,856.86 €</w:t>
+        <w:t>Zwischensumme Hardware: 51.108,12 €</w:t>
         <w:br/>
       </w:r>
       <w:r>
-        <w:t>Zwischensumme Software: 7,188.48 €</w:t>
+        <w:t>Zwischensumme Software: 10.021,20 €</w:t>
         <w:br/>
       </w:r>
       <w:r>
@@ -979,18 +979,18 @@
         <w:rPr>
           <w:b/>
         </w:rPr>
-        <w:t>Gesamtsumme Netto: 68,095.34 €</w:t>
+        <w:t>Gesamtsumme Netto: 67.179,32 €</w:t>
         <w:br/>
       </w:r>
       <w:r>
-        <w:t>zzgl. 19% USt.: 12,938.11 €</w:t>
+        <w:t>zzgl. 19% USt.: 12.764,07 €</w:t>
         <w:br/>
       </w:r>
       <w:r>
         <w:rPr>
           <w:b/>
         </w:rPr>
-        <w:t>Gesamtsumme Brutto: 81,033.45 €</w:t>
+        <w:t>Gesamtsumme Brutto: 79.943,39 €</w:t>
       </w:r>
     </w:p>
     <w:p>

</xml_diff>